<commit_message>
Render pull_request b9c5ca9b86a5d8b58df5320cc1aa30ee6fac9d2f Revise boxes per verified Trends Open guidelines (#8) b9c5ca9b86a5d8b58df5320cc1aa30ee6fac9d2f
</commit_message>
<xml_diff>
--- a/pr/28/manuscript.docx
+++ b/pr/28/manuscript.docx
@@ -3025,13 +3025,10 @@
                 <w:b/>
                 <w:bCs/>
               </w:rPr>
-              <w:t xml:space="preserve">CFDE</w:t>
-            </w:r>
-            <w:r>
-              <w:t xml:space="preserve"> </w:t>
-            </w:r>
-            <w:r>
-              <w:t xml:space="preserve">(Common Fund Data Ecosystem): NIH cross-cutting initiative that harmonizes metadata and tooling across 19 Common Fund programs so researchers can find and reuse data across the portfolio.</w:t>
+              <w:t xml:space="preserve">CFDE (Common Fund Data Ecosystem)</w:t>
+            </w:r>
+            <w:r>
+              <w:t xml:space="preserve">: NIH cross-cutting initiative that harmonizes metadata and tooling across 19 Common Fund programs so researchers can find and reuse data across the portfolio.</w:t>
             </w:r>
           </w:p>
           <w:p>
@@ -3043,13 +3040,10 @@
                 <w:b/>
                 <w:bCs/>
               </w:rPr>
-              <w:t xml:space="preserve">CWIC</w:t>
-            </w:r>
-            <w:r>
-              <w:t xml:space="preserve"> </w:t>
-            </w:r>
-            <w:r>
-              <w:t xml:space="preserve">(Cloud Workspace Implementation Center): CFDE center providing computational infrastructure for in-place analysis of large-scale shared datasets.</w:t>
+              <w:t xml:space="preserve">CWIC (Cloud Workspace Implementation Center)</w:t>
+            </w:r>
+            <w:r>
+              <w:t xml:space="preserve">: CFDE center providing computational infrastructure for in-place analysis of large-scale shared datasets.</w:t>
             </w:r>
           </w:p>
           <w:p>
@@ -3061,13 +3055,10 @@
                 <w:b/>
                 <w:bCs/>
               </w:rPr>
-              <w:t xml:space="preserve">DMS Policy</w:t>
-            </w:r>
-            <w:r>
-              <w:t xml:space="preserve"> </w:t>
-            </w:r>
-            <w:r>
-              <w:t xml:space="preserve">(NIH Data Management and Sharing Policy): The 2023 NIH policy requiring grantees to plan for data sharing, which establishes a pre-policy baseline against which sharing and reuse improvements can be measured.</w:t>
+              <w:t xml:space="preserve">DMS Policy (NIH Data Management and Sharing Policy)</w:t>
+            </w:r>
+            <w:r>
+              <w:t xml:space="preserve">: The 2023 NIH policy requiring grantees to plan for data sharing, which establishes a pre-policy baseline against which sharing and reuse improvements can be measured.</w:t>
             </w:r>
           </w:p>
           <w:p>
@@ -3079,13 +3070,10 @@
                 <w:b/>
                 <w:bCs/>
               </w:rPr>
-              <w:t xml:space="preserve">DRC</w:t>
-            </w:r>
-            <w:r>
-              <w:t xml:space="preserve"> </w:t>
-            </w:r>
-            <w:r>
-              <w:t xml:space="preserve">(Data Resource Center): CFDE center enabling discovery of CFDE data and other resources.</w:t>
+              <w:t xml:space="preserve">DRC (Data Resource Center)</w:t>
+            </w:r>
+            <w:r>
+              <w:t xml:space="preserve">: CFDE center enabling discovery of CFDE data and other resources.</w:t>
             </w:r>
           </w:p>
           <w:p>
@@ -3127,13 +3115,10 @@
                 <w:b/>
                 <w:bCs/>
               </w:rPr>
-              <w:t xml:space="preserve">FAIRplus-DSM</w:t>
-            </w:r>
-            <w:r>
-              <w:t xml:space="preserve"> </w:t>
-            </w:r>
-            <w:r>
-              <w:t xml:space="preserve">(FAIRplus Dataset Maturity model): Six-level maturity scale that operationalizes the FAIR principles for life-sciences data, from Level 0 (no identifiers, local storage) to Level 5 (enterprise-grade lifecycle management with cross-community provenance).</w:t>
+              <w:t xml:space="preserve">FAIRplus-DSM (FAIRplus Dataset Maturity model)</w:t>
+            </w:r>
+            <w:r>
+              <w:t xml:space="preserve">: Six-level maturity scale that operationalizes the FAIR principles for life-sciences data, from Level 0 (no identifiers, local storage) to Level 5 (enterprise-grade lifecycle management with cross-community provenance).</w:t>
             </w:r>
           </w:p>
           <w:p>
@@ -3145,13 +3130,10 @@
                 <w:b/>
                 <w:bCs/>
               </w:rPr>
-              <w:t xml:space="preserve">GA4GH</w:t>
-            </w:r>
-            <w:r>
-              <w:t xml:space="preserve"> </w:t>
-            </w:r>
-            <w:r>
-              <w:t xml:space="preserve">(Global Alliance for Genomics and Health): International standards organization whose</w:t>
+              <w:t xml:space="preserve">GA4GH (Global Alliance for Genomics and Health)</w:t>
+            </w:r>
+            <w:r>
+              <w:t xml:space="preserve">: International standards organization whose</w:t>
             </w:r>
             <w:r>
               <w:t xml:space="preserve"> </w:t>
@@ -3175,13 +3157,10 @@
                 <w:b/>
                 <w:bCs/>
               </w:rPr>
-              <w:t xml:space="preserve">ICC</w:t>
-            </w:r>
-            <w:r>
-              <w:t xml:space="preserve"> </w:t>
-            </w:r>
-            <w:r>
-              <w:t xml:space="preserve">(Integration and Coordination Center): CFDE center responsible for cross-portfolio coordination, evaluation, and the centralized metrics dashboard described here.</w:t>
+              <w:t xml:space="preserve">ICC (Integration and Coordination Center)</w:t>
+            </w:r>
+            <w:r>
+              <w:t xml:space="preserve">: CFDE center responsible for cross-portfolio coordination, evaluation, and the centralized metrics dashboard described here.</w:t>
             </w:r>
           </w:p>
           <w:p>
@@ -3193,13 +3172,10 @@
                 <w:b/>
                 <w:bCs/>
               </w:rPr>
-              <w:t xml:space="preserve">KC</w:t>
-            </w:r>
-            <w:r>
-              <w:t xml:space="preserve"> </w:t>
-            </w:r>
-            <w:r>
-              <w:t xml:space="preserve">(Knowledge Center): CFDE center supporting analyses that yield cross-cutting biological insights through applications and outreach.</w:t>
+              <w:t xml:space="preserve">KC (Knowledge Center)</w:t>
+            </w:r>
+            <w:r>
+              <w:t xml:space="preserve">: CFDE center supporting analyses that yield cross-cutting biological insights through applications and outreach.</w:t>
             </w:r>
           </w:p>
           <w:p>
@@ -3211,13 +3187,10 @@
                 <w:b/>
                 <w:bCs/>
               </w:rPr>
-              <w:t xml:space="preserve">MCDA</w:t>
-            </w:r>
-            <w:r>
-              <w:t xml:space="preserve"> </w:t>
-            </w:r>
-            <w:r>
-              <w:t xml:space="preserve">(Multi-Criteria Decision Analysis): A decision-making approach that combines multiple weighted performance dimensions into a single composite score.</w:t>
+              <w:t xml:space="preserve">MCDA (Multi-Criteria Decision Analysis)</w:t>
+            </w:r>
+            <w:r>
+              <w:t xml:space="preserve">: A decision-making approach that combines multiple weighted performance dimensions into a single composite score.</w:t>
             </w:r>
           </w:p>
           <w:p>
@@ -3244,13 +3217,10 @@
                 <w:b/>
                 <w:bCs/>
               </w:rPr>
-              <w:t xml:space="preserve">PIsCO</w:t>
-            </w:r>
-            <w:r>
-              <w:t xml:space="preserve"> </w:t>
-            </w:r>
-            <w:r>
-              <w:t xml:space="preserve">(Performance Indicators framework for Collection of bioinformatics resource metrics): Server-side framework for automated collection and visualization of software-quality metrics, allowing software health data to feed an evaluation dashboard directly.</w:t>
+              <w:t xml:space="preserve">PIsCO (Performance Indicators framework for Collection of bioinformatics resource metrics)</w:t>
+            </w:r>
+            <w:r>
+              <w:t xml:space="preserve">: Server-side framework for automated collection and visualization of software-quality metrics, allowing software health data to feed an evaluation dashboard directly.</w:t>
             </w:r>
           </w:p>
           <w:p>
@@ -3262,13 +3232,10 @@
                 <w:b/>
                 <w:bCs/>
               </w:rPr>
-              <w:t xml:space="preserve">RCR</w:t>
-            </w:r>
-            <w:r>
-              <w:t xml:space="preserve"> </w:t>
-            </w:r>
-            <w:r>
-              <w:t xml:space="preserve">(Relative Citation Ratio): NIH iCite metric that benchmarks an article’s citation rate against field-specific expectations.</w:t>
+              <w:t xml:space="preserve">RCR (Relative Citation Ratio)</w:t>
+            </w:r>
+            <w:r>
+              <w:t xml:space="preserve">: NIH iCite metric that benchmarks an article’s citation rate against field-specific expectations.</w:t>
             </w:r>
           </w:p>
           <w:p>
@@ -3280,13 +3247,10 @@
                 <w:b/>
                 <w:bCs/>
               </w:rPr>
-              <w:t xml:space="preserve">RDA</w:t>
-            </w:r>
-            <w:r>
-              <w:t xml:space="preserve"> </w:t>
-            </w:r>
-            <w:r>
-              <w:t xml:space="preserve">(Research Data Alliance): International community that classifies FAIR indicators by priority (Essential, Important, Useful), providing a tiered roadmap for incremental FAIR improvement.</w:t>
+              <w:t xml:space="preserve">RDA (Research Data Alliance)</w:t>
+            </w:r>
+            <w:r>
+              <w:t xml:space="preserve">: International community that classifies FAIR indicators by priority (Essential, Important, Useful), providing a tiered roadmap for incremental FAIR improvement.</w:t>
             </w:r>
           </w:p>
           <w:p>
@@ -3298,13 +3262,10 @@
                 <w:b/>
                 <w:bCs/>
               </w:rPr>
-              <w:t xml:space="preserve">RICE</w:t>
-            </w:r>
-            <w:r>
-              <w:t xml:space="preserve"> </w:t>
-            </w:r>
-            <w:r>
-              <w:t xml:space="preserve">(Reach, Impact, Confidence, Effort): Product-management prioritization framework that scores candidate work items by Reach × Impact × Confidence / Effort.</w:t>
+              <w:t xml:space="preserve">RICE (Reach, Impact, Confidence, Effort)</w:t>
+            </w:r>
+            <w:r>
+              <w:t xml:space="preserve">: Product-management prioritization framework that scores candidate work items by Reach × Impact × Confidence / Effort.</w:t>
             </w:r>
           </w:p>
           <w:p>
@@ -3319,13 +3280,10 @@
                 <w:b/>
                 <w:bCs/>
               </w:rPr>
-              <w:t xml:space="preserve">TC</w:t>
-            </w:r>
-            <w:r>
-              <w:t xml:space="preserve"> </w:t>
-            </w:r>
-            <w:r>
-              <w:t xml:space="preserve">(Training Center): CFDE center addressing skills development and the cultural shift required for cloud-based scientific computing.</w:t>
+              <w:t xml:space="preserve">TC (Training Center)</w:t>
+            </w:r>
+            <w:r>
+              <w:t xml:space="preserve">: CFDE center addressing skills development and the cultural shift required for cloud-based scientific computing.</w:t>
             </w:r>
           </w:p>
           <w:p/>

</xml_diff>